<commit_message>
Colored districts file added
</commit_message>
<xml_diff>
--- a/plan.docx
+++ b/plan.docx
@@ -3,6 +3,716 @@
 <w:document xmlns:wpc="http://schemas.microsoft.com/office/word/2010/wordprocessingCanvas" xmlns:cx="http://schemas.microsoft.com/office/drawing/2014/chartex" xmlns:cx1="http://schemas.microsoft.com/office/drawing/2015/9/8/chartex" xmlns:cx2="http://schemas.microsoft.com/office/drawing/2015/10/21/chartex" xmlns:cx3="http://schemas.microsoft.com/office/drawing/2016/5/9/chartex" xmlns:cx4="http://schemas.microsoft.com/office/drawing/2016/5/10/chartex" xmlns:cx5="http://schemas.microsoft.com/office/drawing/2016/5/11/chartex" xmlns:cx6="http://schemas.microsoft.com/office/drawing/2016/5/12/chartex" xmlns:cx7="http://schemas.microsoft.com/office/drawing/2016/5/13/chartex" xmlns:cx8="http://schemas.microsoft.com/office/drawing/2016/5/14/chartex" xmlns:mc="http://schemas.openxmlformats.org/markup-compatibility/2006" xmlns:aink="http://schemas.microsoft.com/office/drawing/2016/ink" xmlns:am3d="http://schemas.microsoft.com/office/drawing/2017/model3d" xmlns:o="urn:schemas-microsoft-com:office:office" xmlns:oel="http://schemas.microsoft.com/office/2019/extlst" xmlns:r="http://schemas.openxmlformats.org/officeDocument/2006/relationships" xmlns:m="http://schemas.openxmlformats.org/officeDocument/2006/math" xmlns:v="urn:schemas-microsoft-com:vml" xmlns:wp14="http://schemas.microsoft.com/office/word/2010/wordprocessingDrawing" xmlns:wp="http://schemas.openxmlformats.org/drawingml/2006/wordprocessingDrawing" xmlns:w10="urn:schemas-microsoft-com:office:word" xmlns:w="http://schemas.openxmlformats.org/wordprocessingml/2006/main" xmlns:w14="http://schemas.microsoft.com/office/word/2010/wordml" xmlns:w15="http://schemas.microsoft.com/office/word/2012/wordml" xmlns:w16cex="http://schemas.microsoft.com/office/word/2018/wordml/cex" xmlns:w16cid="http://schemas.microsoft.com/office/word/2016/wordml/cid" xmlns:w16="http://schemas.microsoft.com/office/word/2018/wordml" xmlns:w16du="http://schemas.microsoft.com/office/word/2023/wordml/word16du" xmlns:w16sdtdh="http://schemas.microsoft.com/office/word/2020/wordml/sdtdatahash" xmlns:w16sdtfl="http://schemas.microsoft.com/office/word/2024/wordml/sdtformatlock" xmlns:w16se="http://schemas.microsoft.com/office/word/2015/wordml/symex" xmlns:wpg="http://schemas.microsoft.com/office/word/2010/wordprocessingGroup" xmlns:wpi="http://schemas.microsoft.com/office/word/2010/wordprocessingInk" xmlns:wne="http://schemas.microsoft.com/office/word/2006/wordml" xmlns:wps="http://schemas.microsoft.com/office/word/2010/wordprocessingShape" mc:Ignorable="w14 w15 w16se w16cid w16 w16cex w16sdtdh w16sdtfl w16du wp14">
   <w:body>
     <w:p>
+      <w:proofErr w:type="spellStart"/>
+      <w:r>
+        <w:t>Barishal</w:t>
+      </w:r>
+      <w:proofErr w:type="spellEnd"/>
+      <w:r>
+        <w:t xml:space="preserve"> Division</w:t>
+      </w:r>
+    </w:p>
+    <w:p>
+      <w:proofErr w:type="spellStart"/>
+      <w:r>
+        <w:t>Barguna</w:t>
+      </w:r>
+      <w:proofErr w:type="spellEnd"/>
+      <w:r>
+        <w:t>: #FF5733</w:t>
+      </w:r>
+    </w:p>
+    <w:p>
+      <w:proofErr w:type="spellStart"/>
+      <w:r>
+        <w:t>Barishal</w:t>
+      </w:r>
+      <w:proofErr w:type="spellEnd"/>
+      <w:r>
+        <w:t>: #C70039</w:t>
+      </w:r>
+    </w:p>
+    <w:p>
+      <w:r>
+        <w:t>Bhola: #900C3F</w:t>
+      </w:r>
+    </w:p>
+    <w:p>
+      <w:proofErr w:type="spellStart"/>
+      <w:r>
+        <w:t>Jhalokati</w:t>
+      </w:r>
+      <w:proofErr w:type="spellEnd"/>
+      <w:r>
+        <w:t>: #581845</w:t>
+      </w:r>
+    </w:p>
+    <w:p>
+      <w:r>
+        <w:t>Patuakhali: #FFC300</w:t>
+      </w:r>
+    </w:p>
+    <w:p>
+      <w:r>
+        <w:t>Pirojpur: #DAF7A6</w:t>
+      </w:r>
+    </w:p>
+    <w:p>
+      <w:r>
+        <w:t>Chattogram Division</w:t>
+      </w:r>
+    </w:p>
+    <w:p>
+      <w:proofErr w:type="spellStart"/>
+      <w:r>
+        <w:t>Bandarban</w:t>
+      </w:r>
+      <w:proofErr w:type="spellEnd"/>
+      <w:r>
+        <w:t>: #2ECC71</w:t>
+      </w:r>
+    </w:p>
+    <w:p>
+      <w:proofErr w:type="spellStart"/>
+      <w:r>
+        <w:t>Brahmanbaria</w:t>
+      </w:r>
+      <w:proofErr w:type="spellEnd"/>
+      <w:r>
+        <w:t>: #27AE60</w:t>
+      </w:r>
+    </w:p>
+    <w:p>
+      <w:r>
+        <w:t>Chandpur: #229954</w:t>
+      </w:r>
+    </w:p>
+    <w:p>
+      <w:r>
+        <w:t>Chattogram: #1E8449</w:t>
+      </w:r>
+    </w:p>
+    <w:p>
+      <w:proofErr w:type="spellStart"/>
+      <w:r>
+        <w:t>Cumilla</w:t>
+      </w:r>
+      <w:proofErr w:type="spellEnd"/>
+      <w:r>
+        <w:t>: #196F3D</w:t>
+      </w:r>
+    </w:p>
+    <w:p>
+      <w:r>
+        <w:t>Cox's Bazar: #145A32</w:t>
+      </w:r>
+    </w:p>
+    <w:p>
+      <w:r>
+        <w:t>Feni: #52BE80</w:t>
+      </w:r>
+    </w:p>
+    <w:p>
+      <w:proofErr w:type="spellStart"/>
+      <w:r>
+        <w:t>Khagrachari</w:t>
+      </w:r>
+      <w:proofErr w:type="spellEnd"/>
+      <w:r>
+        <w:t>: #58D68D</w:t>
+      </w:r>
+    </w:p>
+    <w:p>
+      <w:proofErr w:type="spellStart"/>
+      <w:r>
+        <w:t>Lakshmipur</w:t>
+      </w:r>
+      <w:proofErr w:type="spellEnd"/>
+      <w:r>
+        <w:t>: #82E0AA</w:t>
+      </w:r>
+    </w:p>
+    <w:p>
+      <w:r>
+        <w:t>Noakhali: #ABEBC6</w:t>
+      </w:r>
+    </w:p>
+    <w:p>
+      <w:r>
+        <w:t xml:space="preserve">Rangamati: #D5F5E3 </w:t>
+      </w:r>
+    </w:p>
+    <w:p/>
+    <w:p>
+      <w:r>
+        <w:t>Dhaka Division</w:t>
+      </w:r>
+    </w:p>
+    <w:p>
+      <w:r>
+        <w:t>Dhaka: #3498DB</w:t>
+      </w:r>
+    </w:p>
+    <w:p>
+      <w:r>
+        <w:t>Faridpur: #2E86C1</w:t>
+      </w:r>
+    </w:p>
+    <w:p>
+      <w:r>
+        <w:t>Gazipur: #2874A6</w:t>
+      </w:r>
+    </w:p>
+    <w:p>
+      <w:r>
+        <w:t>Gopalganj: #21618C</w:t>
+      </w:r>
+    </w:p>
+    <w:p>
+      <w:r>
+        <w:t>Kishoreganj: #1B4F72</w:t>
+      </w:r>
+    </w:p>
+    <w:p>
+      <w:r>
+        <w:t>Madaripur: #5DADE2</w:t>
+      </w:r>
+    </w:p>
+    <w:p>
+      <w:r>
+        <w:t>Manikganj: #85C1E9</w:t>
+      </w:r>
+    </w:p>
+    <w:p>
+      <w:proofErr w:type="spellStart"/>
+      <w:r>
+        <w:t>Munshiganj</w:t>
+      </w:r>
+      <w:proofErr w:type="spellEnd"/>
+      <w:r>
+        <w:t>: #AED6F1</w:t>
+      </w:r>
+    </w:p>
+    <w:p>
+      <w:r>
+        <w:lastRenderedPageBreak/>
+        <w:t>Narayanganj: #D6EAF8</w:t>
+      </w:r>
+    </w:p>
+    <w:p>
+      <w:r>
+        <w:t>Narsingdi: #EBF5FB</w:t>
+      </w:r>
+    </w:p>
+    <w:p>
+      <w:r>
+        <w:t>Rajbari: #1F618D</w:t>
+      </w:r>
+    </w:p>
+    <w:p>
+      <w:proofErr w:type="spellStart"/>
+      <w:r>
+        <w:t>Shariatpur</w:t>
+      </w:r>
+      <w:proofErr w:type="spellEnd"/>
+      <w:r>
+        <w:t>: #2980B9</w:t>
+      </w:r>
+    </w:p>
+    <w:p>
+      <w:r>
+        <w:t xml:space="preserve">Tangail: #5499C7 </w:t>
+      </w:r>
+    </w:p>
+    <w:p>
+      <w:r>
+        <w:t>Khulna Division</w:t>
+      </w:r>
+    </w:p>
+    <w:p>
+      <w:r>
+        <w:t>Bagerhat: #9B59B6</w:t>
+      </w:r>
+    </w:p>
+    <w:p>
+      <w:proofErr w:type="spellStart"/>
+      <w:r>
+        <w:t>Chuadanga</w:t>
+      </w:r>
+      <w:proofErr w:type="spellEnd"/>
+      <w:r>
+        <w:t>: #8E44AD</w:t>
+      </w:r>
+    </w:p>
+    <w:p>
+      <w:proofErr w:type="spellStart"/>
+      <w:r>
+        <w:t>Jashore</w:t>
+      </w:r>
+      <w:proofErr w:type="spellEnd"/>
+      <w:r>
+        <w:t>: #7D3C98</w:t>
+      </w:r>
+    </w:p>
+    <w:p>
+      <w:proofErr w:type="spellStart"/>
+      <w:r>
+        <w:t>Jhenaidah</w:t>
+      </w:r>
+      <w:proofErr w:type="spellEnd"/>
+      <w:r>
+        <w:t>: #6C3483</w:t>
+      </w:r>
+    </w:p>
+    <w:p>
+      <w:r>
+        <w:t>Khulna: #5B2C6F</w:t>
+      </w:r>
+    </w:p>
+    <w:p>
+      <w:proofErr w:type="spellStart"/>
+      <w:r>
+        <w:t>Kushtia</w:t>
+      </w:r>
+      <w:proofErr w:type="spellEnd"/>
+      <w:r>
+        <w:t>: #4A235A</w:t>
+      </w:r>
+    </w:p>
+    <w:p>
+      <w:r>
+        <w:t>Magura: #A569BD</w:t>
+      </w:r>
+    </w:p>
+    <w:p>
+      <w:proofErr w:type="spellStart"/>
+      <w:r>
+        <w:t>Meherpur</w:t>
+      </w:r>
+      <w:proofErr w:type="spellEnd"/>
+      <w:r>
+        <w:t>: #BB8FCE</w:t>
+      </w:r>
+    </w:p>
+    <w:p>
+      <w:r>
+        <w:t>Narail: #D2B4DE</w:t>
+      </w:r>
+    </w:p>
+    <w:p>
+      <w:proofErr w:type="spellStart"/>
+      <w:r>
+        <w:t>Satkhira</w:t>
+      </w:r>
+      <w:proofErr w:type="spellEnd"/>
+      <w:r>
+        <w:t xml:space="preserve">: #E8DAEF </w:t>
+      </w:r>
+    </w:p>
+    <w:p>
+      <w:r>
+        <w:t>Mymensingh Division</w:t>
+      </w:r>
+    </w:p>
+    <w:p>
+      <w:r>
+        <w:t>Jamalpur: #F39C12</w:t>
+      </w:r>
+    </w:p>
+    <w:p>
+      <w:r>
+        <w:t>Mymensingh: #E67E22</w:t>
+      </w:r>
+    </w:p>
+    <w:p>
+      <w:proofErr w:type="spellStart"/>
+      <w:r>
+        <w:t>Netrokona</w:t>
+      </w:r>
+      <w:proofErr w:type="spellEnd"/>
+      <w:r>
+        <w:t>: #D35400</w:t>
+      </w:r>
+    </w:p>
+    <w:p>
+      <w:proofErr w:type="spellStart"/>
+      <w:r>
+        <w:t>Sherpur</w:t>
+      </w:r>
+      <w:proofErr w:type="spellEnd"/>
+      <w:r>
+        <w:t>: #BA4A00</w:t>
+      </w:r>
+    </w:p>
+    <w:p>
+      <w:proofErr w:type="spellStart"/>
+      <w:r>
+        <w:t>Rajshahi</w:t>
+      </w:r>
+      <w:proofErr w:type="spellEnd"/>
+      <w:r>
+        <w:t xml:space="preserve"> Division</w:t>
+      </w:r>
+    </w:p>
+    <w:p>
+      <w:proofErr w:type="spellStart"/>
+      <w:r>
+        <w:t>Bogura</w:t>
+      </w:r>
+      <w:proofErr w:type="spellEnd"/>
+      <w:r>
+        <w:t>: #1ABC9C</w:t>
+      </w:r>
+    </w:p>
+    <w:p>
+      <w:proofErr w:type="spellStart"/>
+      <w:r>
+        <w:t>Joypurhat</w:t>
+      </w:r>
+      <w:proofErr w:type="spellEnd"/>
+      <w:r>
+        <w:t>: #16A085</w:t>
+      </w:r>
+    </w:p>
+    <w:p>
+      <w:proofErr w:type="spellStart"/>
+      <w:r>
+        <w:t>Naogaon</w:t>
+      </w:r>
+      <w:proofErr w:type="spellEnd"/>
+      <w:r>
+        <w:t>: #138D75</w:t>
+      </w:r>
+    </w:p>
+    <w:p>
+      <w:proofErr w:type="spellStart"/>
+      <w:r>
+        <w:t>Natore</w:t>
+      </w:r>
+      <w:proofErr w:type="spellEnd"/>
+      <w:r>
+        <w:t>: #117A65</w:t>
+      </w:r>
+    </w:p>
+    <w:p>
+      <w:proofErr w:type="spellStart"/>
+      <w:r>
+        <w:t>Chapai</w:t>
+      </w:r>
+      <w:proofErr w:type="spellEnd"/>
+      <w:r>
+        <w:t xml:space="preserve"> Nawabganj: #0E6655</w:t>
+      </w:r>
+    </w:p>
+    <w:p>
+      <w:r>
+        <w:t>Pabna: #48C9B0</w:t>
+      </w:r>
+    </w:p>
+    <w:p>
+      <w:proofErr w:type="spellStart"/>
+      <w:r>
+        <w:t>Rajshahi</w:t>
+      </w:r>
+      <w:proofErr w:type="spellEnd"/>
+      <w:r>
+        <w:t>: #76D7C4</w:t>
+      </w:r>
+    </w:p>
+    <w:p>
+      <w:r>
+        <w:lastRenderedPageBreak/>
+        <w:t>Sirajganj: #A3E4D7</w:t>
+      </w:r>
+    </w:p>
+    <w:p>
+      <w:r>
+        <w:t>Rangpur Division</w:t>
+      </w:r>
+    </w:p>
+    <w:p>
+      <w:r>
+        <w:t>Dinajpur: #F4D03F</w:t>
+      </w:r>
+    </w:p>
+    <w:p>
+      <w:r>
+        <w:t>Gaibandha: #F1C40F</w:t>
+      </w:r>
+    </w:p>
+    <w:p>
+      <w:proofErr w:type="spellStart"/>
+      <w:r>
+        <w:t>Kurigram</w:t>
+      </w:r>
+      <w:proofErr w:type="spellEnd"/>
+      <w:r>
+        <w:t>: #D4AC0D</w:t>
+      </w:r>
+    </w:p>
+    <w:p>
+      <w:proofErr w:type="spellStart"/>
+      <w:r>
+        <w:t>Lalmonirhat</w:t>
+      </w:r>
+      <w:proofErr w:type="spellEnd"/>
+      <w:r>
+        <w:t>: #B7950B</w:t>
+      </w:r>
+    </w:p>
+    <w:p>
+      <w:proofErr w:type="spellStart"/>
+      <w:r>
+        <w:t>Nilphamari</w:t>
+      </w:r>
+      <w:proofErr w:type="spellEnd"/>
+      <w:r>
+        <w:t>: #9A7D0A</w:t>
+      </w:r>
+    </w:p>
+    <w:p>
+      <w:proofErr w:type="spellStart"/>
+      <w:r>
+        <w:t>Panchagarh</w:t>
+      </w:r>
+      <w:proofErr w:type="spellEnd"/>
+      <w:r>
+        <w:t>: #7D6608</w:t>
+      </w:r>
+    </w:p>
+    <w:p>
+      <w:r>
+        <w:t>Rangpur: #F7DC6F</w:t>
+      </w:r>
+    </w:p>
+    <w:p>
+      <w:r>
+        <w:t xml:space="preserve">Thakurgaon: #F9E79F </w:t>
+      </w:r>
+    </w:p>
+    <w:p>
+      <w:r>
+        <w:t>Sylhet Division</w:t>
+      </w:r>
+    </w:p>
+    <w:p>
+      <w:r>
+        <w:t>Habiganj: #BDC3C7</w:t>
+      </w:r>
+    </w:p>
+    <w:p>
+      <w:proofErr w:type="spellStart"/>
+      <w:r>
+        <w:t>Moulvibazar</w:t>
+      </w:r>
+      <w:proofErr w:type="spellEnd"/>
+      <w:r>
+        <w:t>: #95A5A6</w:t>
+      </w:r>
+    </w:p>
+    <w:p>
+      <w:r>
+        <w:t>Sunamganj: #7F8C8D</w:t>
+      </w:r>
+    </w:p>
+    <w:p>
+      <w:pPr>
+        <w:rPr>
+          <w:rFonts w:eastAsia="Times New Roman" w:cs="Times New Roman"/>
+          <w:kern w:val="0"/>
+          <w14:ligatures w14:val="none"/>
+        </w:rPr>
+      </w:pPr>
+      <w:r>
+        <w:t>Sylhet: #707B7C</w:t>
+      </w:r>
+      <w:r>
+        <w:br w:type="page"/>
+      </w:r>
+    </w:p>
+    <w:p>
+      <w:pPr>
+        <w:pStyle w:val="NormalWeb"/>
+      </w:pPr>
+      <w:r>
+        <w:lastRenderedPageBreak/>
+        <w:t>ok forget the plan.</w:t>
+      </w:r>
+    </w:p>
+    <w:p>
+      <w:pPr>
+        <w:pStyle w:val="NormalWeb"/>
+      </w:pPr>
+      <w:r>
+        <w:t>Starts from scratch.</w:t>
+      </w:r>
+    </w:p>
+    <w:p>
+      <w:pPr>
+        <w:pStyle w:val="NormalWeb"/>
+      </w:pPr>
+      <w:r>
+        <w:t xml:space="preserve">I want this to be the process - </w:t>
+      </w:r>
+    </w:p>
+    <w:p>
+      <w:pPr>
+        <w:pStyle w:val="NormalWeb"/>
+      </w:pPr>
+      <w:r>
+        <w:t xml:space="preserve">I already have bd districts, division working project. That </w:t>
+      </w:r>
+      <w:proofErr w:type="spellStart"/>
+      <w:r>
+        <w:t>svg</w:t>
+      </w:r>
+      <w:proofErr w:type="spellEnd"/>
+      <w:r>
+        <w:t xml:space="preserve"> has its own format.</w:t>
+      </w:r>
+    </w:p>
+    <w:p>
+      <w:pPr>
+        <w:pStyle w:val="NormalWeb"/>
+      </w:pPr>
+      <w:r>
+        <w:t xml:space="preserve">Now I want to add continents, </w:t>
+      </w:r>
+      <w:proofErr w:type="spellStart"/>
+      <w:r>
+        <w:t>asian</w:t>
+      </w:r>
+      <w:proofErr w:type="spellEnd"/>
+      <w:r>
+        <w:t xml:space="preserve"> countries, the liberation war sector </w:t>
+      </w:r>
+      <w:proofErr w:type="spellStart"/>
+      <w:r>
+        <w:t>etc</w:t>
+      </w:r>
+      <w:proofErr w:type="spellEnd"/>
+      <w:r>
+        <w:t xml:space="preserve"> and more. Each will have a different SVG format.</w:t>
+      </w:r>
+    </w:p>
+    <w:p>
+      <w:pPr>
+        <w:pStyle w:val="NormalWeb"/>
+      </w:pPr>
+      <w:proofErr w:type="gramStart"/>
+      <w:r>
+        <w:t>So</w:t>
+      </w:r>
+      <w:proofErr w:type="gramEnd"/>
+      <w:r>
+        <w:t xml:space="preserve"> a system that I need is, I get a new </w:t>
+      </w:r>
+      <w:proofErr w:type="spellStart"/>
+      <w:r>
+        <w:t>svg</w:t>
+      </w:r>
+      <w:proofErr w:type="spellEnd"/>
+      <w:r>
+        <w:t xml:space="preserve"> format, I will just introduce the format to the system, the system will process the format, convert as its </w:t>
+      </w:r>
+      <w:proofErr w:type="spellStart"/>
+      <w:r>
+        <w:t>neede</w:t>
+      </w:r>
+      <w:proofErr w:type="spellEnd"/>
+      <w:r>
+        <w:t xml:space="preserve"> and work with that.</w:t>
+      </w:r>
+    </w:p>
+    <w:p>
+      <w:pPr>
+        <w:pStyle w:val="NormalWeb"/>
+      </w:pPr>
+      <w:proofErr w:type="gramStart"/>
+      <w:r>
+        <w:t>So</w:t>
+      </w:r>
+      <w:proofErr w:type="gramEnd"/>
+      <w:r>
+        <w:t xml:space="preserve"> there might have a compiler like code that will translate the raw </w:t>
+      </w:r>
+      <w:proofErr w:type="spellStart"/>
+      <w:r>
+        <w:t>svg</w:t>
+      </w:r>
+      <w:proofErr w:type="spellEnd"/>
+      <w:r>
+        <w:t xml:space="preserve"> format to the system required format. And for a new format, the compiler may change.</w:t>
+      </w:r>
+    </w:p>
+    <w:p>
+      <w:pPr>
+        <w:pStyle w:val="NormalWeb"/>
+      </w:pPr>
+      <w:r>
+        <w:t>The</w:t>
+      </w:r>
+      <w:r>
+        <w:t xml:space="preserve"> extension plan</w:t>
+      </w:r>
+      <w:r>
+        <w:t xml:space="preserve"> is</w:t>
+      </w:r>
+      <w:r>
+        <w:t xml:space="preserve"> like </w:t>
+      </w:r>
+      <w:proofErr w:type="gramStart"/>
+      <w:r>
+        <w:t>this,</w:t>
+      </w:r>
+      <w:proofErr w:type="gramEnd"/>
+      <w:r>
+        <w:t xml:space="preserve"> suppose I already have a complete bd districts map. Now what if I put our public universities on the map, in which districts? Doing the same for </w:t>
+      </w:r>
+      <w:r>
+        <w:t xml:space="preserve">the </w:t>
+      </w:r>
+      <w:r>
+        <w:t xml:space="preserve">international </w:t>
+      </w:r>
+      <w:r>
+        <w:t>organizations' HQ on the</w:t>
+      </w:r>
+      <w:r>
+        <w:t xml:space="preserve"> world map</w:t>
+      </w:r>
+      <w:r>
+        <w:t>.</w:t>
+      </w:r>
+    </w:p>
+    <w:p>
+      <w:pPr>
+        <w:pStyle w:val="NormalWeb"/>
+      </w:pPr>
+      <w:proofErr w:type="gramStart"/>
+      <w:r>
+        <w:t>Lets</w:t>
+      </w:r>
+      <w:proofErr w:type="gramEnd"/>
+      <w:r>
+        <w:t xml:space="preserve"> see how this could be possible or drawbacks</w:t>
+      </w:r>
+    </w:p>
+    <w:p>
+      <w:pPr>
+        <w:pStyle w:val="NormalWeb"/>
+      </w:pPr>
+      <w:r>
+        <w:rPr>
+          <w:b/>
+          <w:bCs/>
+          <w:sz w:val="36"/>
+          <w:szCs w:val="36"/>
+        </w:rPr>
+        <w:br w:type="page"/>
+      </w:r>
+    </w:p>
+    <w:p>
       <w:pPr>
         <w:spacing w:before="100" w:beforeAutospacing="1" w:after="100" w:afterAutospacing="1" w:line="240" w:lineRule="auto"/>
         <w:outlineLvl w:val="1"/>
@@ -26,6 +736,7 @@
           <w:szCs w:val="36"/>
           <w14:ligatures w14:val="none"/>
         </w:rPr>
+        <w:lastRenderedPageBreak/>
         <w:t>A. Progress Bar</w:t>
       </w:r>
     </w:p>
@@ -599,6 +1310,7 @@
           <w:szCs w:val="36"/>
           <w14:ligatures w14:val="none"/>
         </w:rPr>
+        <w:lastRenderedPageBreak/>
         <w:t>D. Best Time Record</w:t>
       </w:r>
     </w:p>
@@ -617,7 +1329,25 @@
           <w:kern w:val="0"/>
           <w14:ligatures w14:val="none"/>
         </w:rPr>
-        <w:t>Store in browser using localStorage:</w:t>
+        <w:t xml:space="preserve">Store in browser using </w:t>
+      </w:r>
+      <w:proofErr w:type="spellStart"/>
+      <w:r>
+        <w:rPr>
+          <w:rFonts w:eastAsia="Times New Roman" w:cs="Times New Roman"/>
+          <w:kern w:val="0"/>
+          <w14:ligatures w14:val="none"/>
+        </w:rPr>
+        <w:t>localStorage</w:t>
+      </w:r>
+      <w:proofErr w:type="spellEnd"/>
+      <w:r>
+        <w:rPr>
+          <w:rFonts w:eastAsia="Times New Roman" w:cs="Times New Roman"/>
+          <w:kern w:val="0"/>
+          <w14:ligatures w14:val="none"/>
+        </w:rPr>
+        <w:t>:</w:t>
       </w:r>
     </w:p>
     <w:p>
@@ -1063,7 +1793,6 @@
           <w:kern w:val="0"/>
           <w14:ligatures w14:val="none"/>
         </w:rPr>
-        <w:lastRenderedPageBreak/>
         <w:t>Some users hate sound.</w:t>
       </w:r>
     </w:p>
@@ -1162,18 +1891,73 @@
     </w:p>
     <w:p/>
     <w:p>
-      <w:r>
-        <w:t>lets update the UI a bit more.</w:t>
-      </w:r>
-    </w:p>
-    <w:p>
-      <w:r>
-        <w:t>1. Current hud portion, find division, score card, victory card, buttons all are fixed size. So in differnt veiw sometime the get very smaller , overlapped and sometimes larger, overlapped. This should be dynamic, change with the ratio of the view screen.</w:t>
-      </w:r>
-    </w:p>
-    <w:p>
-      <w:r>
-        <w:t>2. There should be a back button to get back to the home page. Or may have options for districts quize and many more will include later.</w:t>
+      <w:proofErr w:type="spellStart"/>
+      <w:proofErr w:type="gramStart"/>
+      <w:r>
+        <w:t>lets</w:t>
+      </w:r>
+      <w:proofErr w:type="spellEnd"/>
+      <w:proofErr w:type="gramEnd"/>
+      <w:r>
+        <w:t xml:space="preserve"> update the UI a bit more.</w:t>
+      </w:r>
+    </w:p>
+    <w:p>
+      <w:r>
+        <w:t xml:space="preserve">1. Current </w:t>
+      </w:r>
+      <w:proofErr w:type="spellStart"/>
+      <w:r>
+        <w:t>hud</w:t>
+      </w:r>
+      <w:proofErr w:type="spellEnd"/>
+      <w:r>
+        <w:t xml:space="preserve"> portion, find division, score card, victory card, buttons all are fixed size. </w:t>
+      </w:r>
+      <w:proofErr w:type="gramStart"/>
+      <w:r>
+        <w:t>So</w:t>
+      </w:r>
+      <w:proofErr w:type="gramEnd"/>
+      <w:r>
+        <w:t xml:space="preserve"> in </w:t>
+      </w:r>
+      <w:proofErr w:type="spellStart"/>
+      <w:r>
+        <w:t>differnt</w:t>
+      </w:r>
+      <w:proofErr w:type="spellEnd"/>
+      <w:r>
+        <w:t xml:space="preserve"> </w:t>
+      </w:r>
+      <w:proofErr w:type="spellStart"/>
+      <w:r>
+        <w:t>veiw</w:t>
+      </w:r>
+      <w:proofErr w:type="spellEnd"/>
+      <w:r>
+        <w:t xml:space="preserve"> sometime the get very </w:t>
+      </w:r>
+      <w:proofErr w:type="gramStart"/>
+      <w:r>
+        <w:t>smaller ,</w:t>
+      </w:r>
+      <w:proofErr w:type="gramEnd"/>
+      <w:r>
+        <w:t xml:space="preserve"> overlapped and sometimes larger, overlapped. This should be dynamic, change with the ratio of the view screen.</w:t>
+      </w:r>
+    </w:p>
+    <w:p>
+      <w:r>
+        <w:t xml:space="preserve">2. There should be a back button to get back to the home page. Or may have options for districts </w:t>
+      </w:r>
+      <w:proofErr w:type="spellStart"/>
+      <w:r>
+        <w:t>quize</w:t>
+      </w:r>
+      <w:proofErr w:type="spellEnd"/>
+      <w:r>
+        <w:t xml:space="preserve"> and many more will include later.</w:t>
       </w:r>
     </w:p>
     <w:p>
@@ -2270,6 +3054,21 @@
       <w:spacing w:val="5"/>
     </w:rPr>
   </w:style>
+  <w:style w:type="paragraph" w:styleId="NormalWeb">
+    <w:name w:val="Normal (Web)"/>
+    <w:basedOn w:val="Normal"/>
+    <w:uiPriority w:val="99"/>
+    <w:unhideWhenUsed/>
+    <w:rsid w:val="004F2B0D"/>
+    <w:pPr>
+      <w:spacing w:before="100" w:beforeAutospacing="1" w:after="100" w:afterAutospacing="1" w:line="240" w:lineRule="auto"/>
+    </w:pPr>
+    <w:rPr>
+      <w:rFonts w:eastAsia="Times New Roman" w:cs="Times New Roman"/>
+      <w:kern w:val="0"/>
+      <w14:ligatures w14:val="none"/>
+    </w:rPr>
+  </w:style>
 </w:styles>
 </file>
 

</xml_diff>

<commit_message>
V7.1 International Organizations HQ quiz feature added (#3)
* Adding Straits

* Update index.html

* Update UX, Logic

* ux update

* test

* Update logic

* UX update

* UX update

* UX update

* Adding Bangla name of organizaiton

* Level Added

* File update
</commit_message>
<xml_diff>
--- a/plan.docx
+++ b/plan.docx
@@ -4,6 +4,205 @@
   <w:body>
     <w:p>
       <w:r>
+        <w:t xml:space="preserve">Building a website for </w:t>
+      </w:r>
+      <w:r>
+        <w:t xml:space="preserve">the </w:t>
+      </w:r>
+      <w:r>
+        <w:t xml:space="preserve">International </w:t>
+      </w:r>
+      <w:r>
+        <w:t>Organizations Headquarters</w:t>
+      </w:r>
+      <w:r>
+        <w:t xml:space="preserve"> quiz</w:t>
+      </w:r>
+    </w:p>
+    <w:p>
+      <w:r>
+        <w:t>Let’s create a website that will generate quizzes for international organizations headquarters. Which I will connect to a dashboard.</w:t>
+      </w:r>
+    </w:p>
+    <w:p>
+      <w:r>
+        <w:t xml:space="preserve">This will be like the game here - </w:t>
+      </w:r>
+      <w:hyperlink r:id="rId5" w:history="1">
+        <w:r>
+          <w:rPr>
+            <w:rStyle w:val="Hyperlink"/>
+          </w:rPr>
+          <w:t>https://world-geography-games.com/en/capitals_asia.html</w:t>
+        </w:r>
+      </w:hyperlink>
+    </w:p>
+    <w:p>
+      <w:r>
+        <w:t xml:space="preserve">Like, there will be a </w:t>
+      </w:r>
+      <w:proofErr w:type="spellStart"/>
+      <w:r>
+        <w:t>js</w:t>
+      </w:r>
+      <w:proofErr w:type="spellEnd"/>
+      <w:r>
+        <w:t xml:space="preserve"> file where I will put the data, </w:t>
+      </w:r>
+      <w:r>
+        <w:t>international organizations</w:t>
+      </w:r>
+      <w:r>
+        <w:t xml:space="preserve"> and their</w:t>
+      </w:r>
+      <w:r>
+        <w:t xml:space="preserve"> headquarters</w:t>
+      </w:r>
+      <w:r>
+        <w:t>. This could be an array.</w:t>
+      </w:r>
+    </w:p>
+    <w:p>
+      <w:r>
+        <w:t>Function:</w:t>
+      </w:r>
+    </w:p>
+    <w:p>
+      <w:pPr>
+        <w:pStyle w:val="ListParagraph"/>
+        <w:numPr>
+          <w:ilvl w:val="0"/>
+          <w:numId w:val="2"/>
+        </w:numPr>
+      </w:pPr>
+      <w:r>
+        <w:t>The website will take data from the data file and generate quizzes with four options from it.</w:t>
+      </w:r>
+    </w:p>
+    <w:p>
+      <w:pPr>
+        <w:pStyle w:val="ListParagraph"/>
+        <w:numPr>
+          <w:ilvl w:val="0"/>
+          <w:numId w:val="2"/>
+        </w:numPr>
+      </w:pPr>
+      <w:r>
+        <w:t>A back button to go to the home page</w:t>
+      </w:r>
+      <w:r>
+        <w:t xml:space="preserve"> and a next button to go to the next question.</w:t>
+      </w:r>
+    </w:p>
+    <w:p>
+      <w:pPr>
+        <w:pStyle w:val="ListParagraph"/>
+        <w:numPr>
+          <w:ilvl w:val="0"/>
+          <w:numId w:val="2"/>
+        </w:numPr>
+      </w:pPr>
+      <w:r>
+        <w:t>The quiz will start when the user clicks anywhere on the screen and a timer will start.</w:t>
+      </w:r>
+    </w:p>
+    <w:p>
+      <w:pPr>
+        <w:pStyle w:val="ListParagraph"/>
+        <w:numPr>
+          <w:ilvl w:val="0"/>
+          <w:numId w:val="2"/>
+        </w:numPr>
+      </w:pPr>
+      <w:r>
+        <w:t xml:space="preserve">Selecting the right option </w:t>
+      </w:r>
+      <w:r>
+        <w:t>will</w:t>
+      </w:r>
+      <w:r>
+        <w:t xml:space="preserve"> turn green</w:t>
+      </w:r>
+      <w:r>
+        <w:t xml:space="preserve"> </w:t>
+      </w:r>
+      <w:r>
+        <w:t>and selecting the wrong one red, showing the correct option in green.</w:t>
+      </w:r>
+    </w:p>
+    <w:p>
+      <w:pPr>
+        <w:pStyle w:val="ListParagraph"/>
+        <w:numPr>
+          <w:ilvl w:val="0"/>
+          <w:numId w:val="2"/>
+        </w:numPr>
+      </w:pPr>
+      <w:r>
+        <w:t>A scorecard will show on the top right corner of the screen, where score will show in the format:</w:t>
+      </w:r>
+      <w:r>
+        <w:t xml:space="preserve"> </w:t>
+      </w:r>
+      <w:r>
+        <w:t>number of questions</w:t>
+      </w:r>
+      <w:r>
+        <w:t>/total question</w:t>
+      </w:r>
+      <w:r>
+        <w:t>s</w:t>
+      </w:r>
+      <w:r>
+        <w:t>. The timer will also show in there.</w:t>
+      </w:r>
+    </w:p>
+    <w:p>
+      <w:pPr>
+        <w:pStyle w:val="ListParagraph"/>
+        <w:numPr>
+          <w:ilvl w:val="0"/>
+          <w:numId w:val="2"/>
+        </w:numPr>
+      </w:pPr>
+    </w:p>
+    <w:p>
+      <w:pPr>
+        <w:pStyle w:val="ListParagraph"/>
+        <w:numPr>
+          <w:ilvl w:val="0"/>
+          <w:numId w:val="2"/>
+        </w:numPr>
+      </w:pPr>
+      <w:r>
+        <w:t>At the end of all questions, a victory card will pop up. Showing score, total time taken, and accuracy.</w:t>
+      </w:r>
+    </w:p>
+    <w:p>
+      <w:r>
+        <w:t>So far, this is my idea. What do you think?</w:t>
+      </w:r>
+    </w:p>
+    <w:p/>
+    <w:p/>
+    <w:p>
+      <w:r>
+        <w:t>and a skip button to skip the question and go to next question.</w:t>
+      </w:r>
+    </w:p>
+    <w:p>
+      <w:r>
+        <w:t>Skipping will shuffle the skipped question.</w:t>
+      </w:r>
+    </w:p>
+    <w:p>
+      <w:r>
+        <w:br w:type="page"/>
+      </w:r>
+    </w:p>
+    <w:p>
+      <w:r>
+        <w:lastRenderedPageBreak/>
         <w:t xml:space="preserve">this is the existing system working code. Now I want to add new world map to the system. But the </w:t>
       </w:r>
       <w:proofErr w:type="spellStart"/>
@@ -20,12 +219,17 @@
         <w:t xml:space="preserve">Now write a new quizeEngine.js, </w:t>
       </w:r>
       <w:proofErr w:type="spellStart"/>
+      <w:proofErr w:type="gramStart"/>
       <w:r>
         <w:t>getWorldMap</w:t>
       </w:r>
       <w:proofErr w:type="spellEnd"/>
       <w:r>
-        <w:t xml:space="preserve">() function, world.html that will work with this new format of </w:t>
+        <w:t>(</w:t>
+      </w:r>
+      <w:proofErr w:type="gramEnd"/>
+      <w:r>
+        <w:t xml:space="preserve">) function, world.html that will work with this new format of </w:t>
       </w:r>
       <w:proofErr w:type="spellStart"/>
       <w:r>
@@ -67,12 +271,17 @@
         <w:t xml:space="preserve">export function </w:t>
       </w:r>
       <w:proofErr w:type="spellStart"/>
+      <w:proofErr w:type="gramStart"/>
       <w:r>
         <w:t>getContinentsMap</w:t>
       </w:r>
       <w:proofErr w:type="spellEnd"/>
       <w:r>
-        <w:t>() {</w:t>
+        <w:t>(</w:t>
+      </w:r>
+      <w:proofErr w:type="gramEnd"/>
+      <w:r>
+        <w:t>) {</w:t>
       </w:r>
     </w:p>
     <w:p>
@@ -158,19 +367,15 @@
       </w:r>
       <w:r>
         <w:tab/>
-        <w:t>"north America",</w:t>
-      </w:r>
-    </w:p>
-    <w:p>
-      <w:r>
-        <w:tab/>
-      </w:r>
-      <w:r>
-        <w:tab/>
-      </w:r>
-      <w:r>
-        <w:tab/>
-        <w:t>"south America",</w:t>
+        <w:t>"</w:t>
+      </w:r>
+      <w:proofErr w:type="gramStart"/>
+      <w:r>
+        <w:t>north</w:t>
+      </w:r>
+      <w:proofErr w:type="gramEnd"/>
+      <w:r>
+        <w:t xml:space="preserve"> America",</w:t>
       </w:r>
     </w:p>
     <w:p>
@@ -184,6 +389,26 @@
         <w:tab/>
         <w:t>"</w:t>
       </w:r>
+      <w:proofErr w:type="gramStart"/>
+      <w:r>
+        <w:t>south</w:t>
+      </w:r>
+      <w:proofErr w:type="gramEnd"/>
+      <w:r>
+        <w:t xml:space="preserve"> America",</w:t>
+      </w:r>
+    </w:p>
+    <w:p>
+      <w:r>
+        <w:tab/>
+      </w:r>
+      <w:r>
+        <w:tab/>
+      </w:r>
+      <w:r>
+        <w:tab/>
+        <w:t>"</w:t>
+      </w:r>
       <w:proofErr w:type="spellStart"/>
       <w:r>
         <w:t>africa</w:t>
@@ -236,7 +461,15 @@
     </w:p>
     <w:p>
       <w:r>
-        <w:t xml:space="preserve">                &lt;path d="M273.67,,171.53L331.94,173.79L330.09,172.44L330.68,171.87Z" fill="#fa4747" stroke="#FFFFFF" stroke-width="2" id="north America" data-name="North America"/&gt;</w:t>
+        <w:t xml:space="preserve">                &lt;path d="M</w:t>
+      </w:r>
+      <w:proofErr w:type="gramStart"/>
+      <w:r>
+        <w:t>273.67,,</w:t>
+      </w:r>
+      <w:proofErr w:type="gramEnd"/>
+      <w:r>
+        <w:t>171.53L331.94,173.79L330.09,172.44L330.68,171.87Z" fill="#fa4747" stroke="#FFFFFF" stroke-width="2" id="north America" data-name="North America"/&gt;</w:t>
       </w:r>
     </w:p>
     <w:p>
@@ -403,8 +636,13 @@
       <w:pPr>
         <w:pStyle w:val="NormalWeb"/>
       </w:pPr>
-      <w:r>
-        <w:t xml:space="preserve">So a system that I need is, I get a new </w:t>
+      <w:proofErr w:type="gramStart"/>
+      <w:r>
+        <w:t>So</w:t>
+      </w:r>
+      <w:proofErr w:type="gramEnd"/>
+      <w:r>
+        <w:t xml:space="preserve"> a system that I need is, I get a new </w:t>
       </w:r>
       <w:proofErr w:type="spellStart"/>
       <w:r>
@@ -427,8 +665,13 @@
       <w:pPr>
         <w:pStyle w:val="NormalWeb"/>
       </w:pPr>
-      <w:r>
-        <w:t xml:space="preserve">So there might have a compiler like code that will translate the raw </w:t>
+      <w:proofErr w:type="gramStart"/>
+      <w:r>
+        <w:t>So</w:t>
+      </w:r>
+      <w:proofErr w:type="gramEnd"/>
+      <w:r>
+        <w:t xml:space="preserve"> there might have a compiler like code that will translate the raw </w:t>
       </w:r>
       <w:proofErr w:type="spellStart"/>
       <w:r>
@@ -453,7 +696,15 @@
         <w:t xml:space="preserve"> is</w:t>
       </w:r>
       <w:r>
-        <w:t xml:space="preserve"> like this, suppose I already have a complete bd districts map. Now what if I put our public universities on the map, in which districts? Doing the same for </w:t>
+        <w:t xml:space="preserve"> like </w:t>
+      </w:r>
+      <w:proofErr w:type="gramStart"/>
+      <w:r>
+        <w:t>this,</w:t>
+      </w:r>
+      <w:proofErr w:type="gramEnd"/>
+      <w:r>
+        <w:t xml:space="preserve"> suppose I already have a complete bd districts map. Now what if I put our public universities on the map, in which districts? Doing the same for </w:t>
       </w:r>
       <w:r>
         <w:t xml:space="preserve">the </w:t>
@@ -475,8 +726,13 @@
       <w:pPr>
         <w:pStyle w:val="NormalWeb"/>
       </w:pPr>
-      <w:r>
-        <w:t>Lets see how this could be possible or drawbacks</w:t>
+      <w:proofErr w:type="gramStart"/>
+      <w:r>
+        <w:t>Lets</w:t>
+      </w:r>
+      <w:proofErr w:type="gramEnd"/>
+      <w:r>
+        <w:t xml:space="preserve"> see how this could be possible or drawbacks</w:t>
       </w:r>
     </w:p>
     <w:p>
@@ -1673,10 +1929,12 @@
     <w:p/>
     <w:p>
       <w:proofErr w:type="spellStart"/>
+      <w:proofErr w:type="gramStart"/>
       <w:r>
         <w:t>lets</w:t>
       </w:r>
       <w:proofErr w:type="spellEnd"/>
+      <w:proofErr w:type="gramEnd"/>
       <w:r>
         <w:t xml:space="preserve"> update the UI a bit more.</w:t>
       </w:r>
@@ -1691,7 +1949,15 @@
       </w:r>
       <w:proofErr w:type="spellEnd"/>
       <w:r>
-        <w:t xml:space="preserve"> portion, find division, score card, victory card, buttons all are fixed size. So in </w:t>
+        <w:t xml:space="preserve"> portion, find division, score card, victory card, buttons all are fixed size. </w:t>
+      </w:r>
+      <w:proofErr w:type="gramStart"/>
+      <w:r>
+        <w:t>So</w:t>
+      </w:r>
+      <w:proofErr w:type="gramEnd"/>
+      <w:r>
+        <w:t xml:space="preserve"> in </w:t>
       </w:r>
       <w:proofErr w:type="spellStart"/>
       <w:r>
@@ -1707,7 +1973,15 @@
       </w:r>
       <w:proofErr w:type="spellEnd"/>
       <w:r>
-        <w:t xml:space="preserve"> sometime the get very smaller , overlapped and sometimes larger, overlapped. This should be dynamic, change with the ratio of the view screen.</w:t>
+        <w:t xml:space="preserve"> sometime the get very </w:t>
+      </w:r>
+      <w:proofErr w:type="gramStart"/>
+      <w:r>
+        <w:t>smaller ,</w:t>
+      </w:r>
+      <w:proofErr w:type="gramEnd"/>
+      <w:r>
+        <w:t xml:space="preserve"> overlapped and sometimes larger, overlapped. This should be dynamic, change with the ratio of the view screen.</w:t>
       </w:r>
     </w:p>
     <w:p>
@@ -1894,8 +2168,100 @@
       </w:rPr>
     </w:lvl>
   </w:abstractNum>
+  <w:abstractNum w:abstractNumId="1" w15:restartNumberingAfterBreak="0">
+    <w:nsid w:val="5E9B354A"/>
+    <w:multiLevelType w:val="hybridMultilevel"/>
+    <w:tmpl w:val="8BC8E93A"/>
+    <w:lvl w:ilvl="0" w:tplc="0409000F">
+      <w:start w:val="1"/>
+      <w:numFmt w:val="decimal"/>
+      <w:lvlText w:val="%1."/>
+      <w:lvlJc w:val="left"/>
+      <w:pPr>
+        <w:ind w:left="360" w:hanging="360"/>
+      </w:pPr>
+      <w:rPr>
+        <w:rFonts w:hint="default"/>
+      </w:rPr>
+    </w:lvl>
+    <w:lvl w:ilvl="1" w:tplc="04090019" w:tentative="1">
+      <w:start w:val="1"/>
+      <w:numFmt w:val="lowerLetter"/>
+      <w:lvlText w:val="%2."/>
+      <w:lvlJc w:val="left"/>
+      <w:pPr>
+        <w:ind w:left="1080" w:hanging="360"/>
+      </w:pPr>
+    </w:lvl>
+    <w:lvl w:ilvl="2" w:tplc="0409001B" w:tentative="1">
+      <w:start w:val="1"/>
+      <w:numFmt w:val="lowerRoman"/>
+      <w:lvlText w:val="%3."/>
+      <w:lvlJc w:val="right"/>
+      <w:pPr>
+        <w:ind w:left="1800" w:hanging="180"/>
+      </w:pPr>
+    </w:lvl>
+    <w:lvl w:ilvl="3" w:tplc="0409000F" w:tentative="1">
+      <w:start w:val="1"/>
+      <w:numFmt w:val="decimal"/>
+      <w:lvlText w:val="%4."/>
+      <w:lvlJc w:val="left"/>
+      <w:pPr>
+        <w:ind w:left="2520" w:hanging="360"/>
+      </w:pPr>
+    </w:lvl>
+    <w:lvl w:ilvl="4" w:tplc="04090019" w:tentative="1">
+      <w:start w:val="1"/>
+      <w:numFmt w:val="lowerLetter"/>
+      <w:lvlText w:val="%5."/>
+      <w:lvlJc w:val="left"/>
+      <w:pPr>
+        <w:ind w:left="3240" w:hanging="360"/>
+      </w:pPr>
+    </w:lvl>
+    <w:lvl w:ilvl="5" w:tplc="0409001B" w:tentative="1">
+      <w:start w:val="1"/>
+      <w:numFmt w:val="lowerRoman"/>
+      <w:lvlText w:val="%6."/>
+      <w:lvlJc w:val="right"/>
+      <w:pPr>
+        <w:ind w:left="3960" w:hanging="180"/>
+      </w:pPr>
+    </w:lvl>
+    <w:lvl w:ilvl="6" w:tplc="0409000F" w:tentative="1">
+      <w:start w:val="1"/>
+      <w:numFmt w:val="decimal"/>
+      <w:lvlText w:val="%7."/>
+      <w:lvlJc w:val="left"/>
+      <w:pPr>
+        <w:ind w:left="4680" w:hanging="360"/>
+      </w:pPr>
+    </w:lvl>
+    <w:lvl w:ilvl="7" w:tplc="04090019" w:tentative="1">
+      <w:start w:val="1"/>
+      <w:numFmt w:val="lowerLetter"/>
+      <w:lvlText w:val="%8."/>
+      <w:lvlJc w:val="left"/>
+      <w:pPr>
+        <w:ind w:left="5400" w:hanging="360"/>
+      </w:pPr>
+    </w:lvl>
+    <w:lvl w:ilvl="8" w:tplc="0409001B" w:tentative="1">
+      <w:start w:val="1"/>
+      <w:numFmt w:val="lowerRoman"/>
+      <w:lvlText w:val="%9."/>
+      <w:lvlJc w:val="right"/>
+      <w:pPr>
+        <w:ind w:left="6120" w:hanging="180"/>
+      </w:pPr>
+    </w:lvl>
+  </w:abstractNum>
   <w:num w:numId="1" w16cid:durableId="2062291604">
     <w:abstractNumId w:val="0"/>
+  </w:num>
+  <w:num w:numId="2" w16cid:durableId="884607965">
+    <w:abstractNumId w:val="1"/>
   </w:num>
 </w:numbering>
 </file>
@@ -2832,6 +3198,29 @@
       <w14:ligatures w14:val="none"/>
     </w:rPr>
   </w:style>
+  <w:style w:type="character" w:styleId="Hyperlink">
+    <w:name w:val="Hyperlink"/>
+    <w:basedOn w:val="DefaultParagraphFont"/>
+    <w:uiPriority w:val="99"/>
+    <w:unhideWhenUsed/>
+    <w:rsid w:val="007C7712"/>
+    <w:rPr>
+      <w:color w:val="0563C1" w:themeColor="hyperlink"/>
+      <w:u w:val="single"/>
+    </w:rPr>
+  </w:style>
+  <w:style w:type="character" w:styleId="UnresolvedMention">
+    <w:name w:val="Unresolved Mention"/>
+    <w:basedOn w:val="DefaultParagraphFont"/>
+    <w:uiPriority w:val="99"/>
+    <w:semiHidden/>
+    <w:unhideWhenUsed/>
+    <w:rsid w:val="007C7712"/>
+    <w:rPr>
+      <w:color w:val="605E5C"/>
+      <w:shd w:val="clear" w:color="auto" w:fill="E1DFDD"/>
+    </w:rPr>
+  </w:style>
 </w:styles>
 </file>
 

</xml_diff>